<commit_message>
docs: the executive decides managers' leave, HR decides the executive's
README pipeline, role table, email rule and migration table (009);
architecture and email guides; the user manual in Markdown, HTML and
the regenerated Word copy, including the new queue names "Manager & HR
leave" for the executive and "Executive leave" for HR.
</commit_message>
<xml_diff>
--- a/docs/08_USER_MANUAL.docx
+++ b/docs/08_USER_MANUAL.docx
@@ -2751,7 +2751,7 @@
       </w:r>
       <w:r>
         <w:rPr/>
-        <w:t>You are a line manager   ──►  HR decides</w:t>
+        <w:t>You are a line manager   ──►  the executive decides</w:t>
       </w:r>
     </w:p>
     <w:p>
@@ -2766,7 +2766,7 @@
       </w:r>
       <w:r>
         <w:rPr/>
-        <w:t>You are an executive     ──►  HR decides</w:t>
+        <w:t>You are in HR            ──►  the executive decides</w:t>
       </w:r>
     </w:p>
     <w:p>
@@ -2781,7 +2781,7 @@
       </w:r>
       <w:r>
         <w:rPr/>
-        <w:t>You are in HR            ──►  the executive decides</w:t>
+        <w:t>You are the executive    ──►  HR decides</w:t>
       </w:r>
     </w:p>
     <w:p>
@@ -4400,7 +4400,7 @@
       </w:pPr>
       <w:r>
         <w:rPr/>
-        <w:t>You decide leave for the people who cannot have it decided by a line manager - line managers and executives - and you own what everyone is entitled to and all company-wide reporting.</w:t>
+        <w:t>You decide the executive's leave, since nobody approves their own, and you own what everyone is entitled to and all company-wide reporting.</w:t>
       </w:r>
     </w:p>
     <w:p>
@@ -4424,11 +4424,11 @@
         <w:rPr>
           <w:rStyle w:val="Strong"/>
         </w:rPr>
-        <w:t>Approvals → Manager &amp; executive leave</w:t>
-      </w:r>
-      <w:r>
-        <w:rPr/>
-        <w:t xml:space="preserve"> holds requests from line managers and executives. Each row says which of the two it is, because that is the useful distinction now: everything in this queue is yours to decide and nothing behind you reviews it. Review, add remarks, then </w:t>
+        <w:t>Approvals → Executive leave</w:t>
+      </w:r>
+      <w:r>
+        <w:rPr/>
+        <w:t xml:space="preserve"> holds the executive's own requests. Everything in this queue is yours to decide and nothing behind you reviews it. Review, add remarks, then </w:t>
       </w:r>
       <w:r>
         <w:rPr>
@@ -4449,7 +4449,7 @@
       </w:pPr>
       <w:r>
         <w:rPr/>
-        <w:t>Employees' leave does not appear here. Their own line manager decides it, and it is approved or declined without reaching you.</w:t>
+        <w:t>Employees' and line managers' leave does not appear here. A line manager decides an employee's, the executive decides a line manager's, and both are approved or declined without reaching you.</w:t>
       </w:r>
     </w:p>
     <w:tbl>
@@ -4765,7 +4765,7 @@
       </w:pPr>
       <w:r>
         <w:rPr/>
-        <w:t>You decide HR's leave, and you have the company-wide view of everyone else's.</w:t>
+        <w:t>You decide line managers' and HR's leave, and you have the company-wide view of everyone else's.</w:t>
       </w:r>
     </w:p>
     <w:p>
@@ -4789,11 +4789,11 @@
         <w:rPr>
           <w:rStyle w:val="Strong"/>
         </w:rPr>
-        <w:t>Approvals → HR leave</w:t>
-      </w:r>
-      <w:r>
-        <w:rPr/>
-        <w:t xml:space="preserve"> lists requests from HR managers, who cannot approve their own. Yours is the only decision on them.</w:t>
+        <w:t>Approvals → Manager &amp; HR leave</w:t>
+      </w:r>
+      <w:r>
+        <w:rPr/>
+        <w:t xml:space="preserve"> lists requests from line managers and from HR managers, none of whom can approve their own. Each row says which of the two it is. Yours is the only decision on them.</w:t>
       </w:r>
     </w:p>
     <w:p>

</xml_diff>